<commit_message>
Move coursework repository link into introduction
</commit_message>
<xml_diff>
--- a/coursework/manuscript/report.docx
+++ b/coursework/manuscript/report.docx
@@ -295,7 +295,7 @@
       <w:r>
         <w:fldChar w:fldCharType="separate"/>
       </w:r>
-      <w:hyperlink w:anchor="_Toc240660960" w:history="1">
+      <w:hyperlink w:anchor="_Toc240662332" w:history="1">
         <w:r>
           <w:rPr>
             <w:rStyle w:val="a6"/>
@@ -322,7 +322,7 @@
             <w:noProof/>
             <w:webHidden/>
           </w:rPr>
-          <w:instrText xml:space="preserve"> PAGEREF _Toc240660960 \h </w:instrText>
+          <w:instrText xml:space="preserve"> PAGEREF _Toc240662332 \h </w:instrText>
         </w:r>
         <w:r>
           <w:rPr>
@@ -369,7 +369,7 @@
           <w14:ligatures w14:val="standardContextual"/>
         </w:rPr>
       </w:pPr>
-      <w:hyperlink w:anchor="_Toc240660961" w:history="1">
+      <w:hyperlink w:anchor="_Toc240662333" w:history="1">
         <w:r>
           <w:rPr>
             <w:rStyle w:val="a6"/>
@@ -396,7 +396,7 @@
             <w:noProof/>
             <w:webHidden/>
           </w:rPr>
-          <w:instrText xml:space="preserve"> PAGEREF _Toc240660961 \h </w:instrText>
+          <w:instrText xml:space="preserve"> PAGEREF _Toc240662333 \h </w:instrText>
         </w:r>
         <w:r>
           <w:rPr>
@@ -443,7 +443,7 @@
           <w14:ligatures w14:val="standardContextual"/>
         </w:rPr>
       </w:pPr>
-      <w:hyperlink w:anchor="_Toc240660962" w:history="1">
+      <w:hyperlink w:anchor="_Toc240662334" w:history="1">
         <w:r>
           <w:rPr>
             <w:rStyle w:val="a6"/>
@@ -470,7 +470,7 @@
             <w:noProof/>
             <w:webHidden/>
           </w:rPr>
-          <w:instrText xml:space="preserve"> PAGEREF _Toc240660962 \h </w:instrText>
+          <w:instrText xml:space="preserve"> PAGEREF _Toc240662334 \h </w:instrText>
         </w:r>
         <w:r>
           <w:rPr>
@@ -517,7 +517,7 @@
           <w14:ligatures w14:val="standardContextual"/>
         </w:rPr>
       </w:pPr>
-      <w:hyperlink w:anchor="_Toc240660963" w:history="1">
+      <w:hyperlink w:anchor="_Toc240662335" w:history="1">
         <w:r>
           <w:rPr>
             <w:rStyle w:val="a6"/>
@@ -544,7 +544,7 @@
             <w:noProof/>
             <w:webHidden/>
           </w:rPr>
-          <w:instrText xml:space="preserve"> PAGEREF _Toc240660963 \h </w:instrText>
+          <w:instrText xml:space="preserve"> PAGEREF _Toc240662335 \h </w:instrText>
         </w:r>
         <w:r>
           <w:rPr>
@@ -591,7 +591,7 @@
           <w14:ligatures w14:val="standardContextual"/>
         </w:rPr>
       </w:pPr>
-      <w:hyperlink w:anchor="_Toc240660964" w:history="1">
+      <w:hyperlink w:anchor="_Toc240662336" w:history="1">
         <w:r>
           <w:rPr>
             <w:rStyle w:val="a6"/>
@@ -618,7 +618,7 @@
             <w:noProof/>
             <w:webHidden/>
           </w:rPr>
-          <w:instrText xml:space="preserve"> PAGEREF _Toc240660964 \h </w:instrText>
+          <w:instrText xml:space="preserve"> PAGEREF _Toc240662336 \h </w:instrText>
         </w:r>
         <w:r>
           <w:rPr>
@@ -665,7 +665,7 @@
           <w14:ligatures w14:val="standardContextual"/>
         </w:rPr>
       </w:pPr>
-      <w:hyperlink w:anchor="_Toc240660965" w:history="1">
+      <w:hyperlink w:anchor="_Toc240662337" w:history="1">
         <w:r>
           <w:rPr>
             <w:rStyle w:val="a6"/>
@@ -692,7 +692,7 @@
             <w:noProof/>
             <w:webHidden/>
           </w:rPr>
-          <w:instrText xml:space="preserve"> PAGEREF _Toc240660965 \h </w:instrText>
+          <w:instrText xml:space="preserve"> PAGEREF _Toc240662337 \h </w:instrText>
         </w:r>
         <w:r>
           <w:rPr>
@@ -739,7 +739,7 @@
           <w14:ligatures w14:val="standardContextual"/>
         </w:rPr>
       </w:pPr>
-      <w:hyperlink w:anchor="_Toc240660966" w:history="1">
+      <w:hyperlink w:anchor="_Toc240662338" w:history="1">
         <w:r>
           <w:rPr>
             <w:rStyle w:val="a6"/>
@@ -766,7 +766,7 @@
             <w:noProof/>
             <w:webHidden/>
           </w:rPr>
-          <w:instrText xml:space="preserve"> PAGEREF _Toc240660966 \h </w:instrText>
+          <w:instrText xml:space="preserve"> PAGEREF _Toc240662338 \h </w:instrText>
         </w:r>
         <w:r>
           <w:rPr>
@@ -813,7 +813,7 @@
           <w14:ligatures w14:val="standardContextual"/>
         </w:rPr>
       </w:pPr>
-      <w:hyperlink w:anchor="_Toc240660967" w:history="1">
+      <w:hyperlink w:anchor="_Toc240662339" w:history="1">
         <w:r>
           <w:rPr>
             <w:rStyle w:val="a6"/>
@@ -840,7 +840,7 @@
             <w:noProof/>
             <w:webHidden/>
           </w:rPr>
-          <w:instrText xml:space="preserve"> PAGEREF _Toc240660967 \h </w:instrText>
+          <w:instrText xml:space="preserve"> PAGEREF _Toc240662339 \h </w:instrText>
         </w:r>
         <w:r>
           <w:rPr>
@@ -887,7 +887,7 @@
           <w14:ligatures w14:val="standardContextual"/>
         </w:rPr>
       </w:pPr>
-      <w:hyperlink w:anchor="_Toc240660968" w:history="1">
+      <w:hyperlink w:anchor="_Toc240662340" w:history="1">
         <w:r>
           <w:rPr>
             <w:rStyle w:val="a6"/>
@@ -914,7 +914,7 @@
             <w:noProof/>
             <w:webHidden/>
           </w:rPr>
-          <w:instrText xml:space="preserve"> PAGEREF _Toc240660968 \h </w:instrText>
+          <w:instrText xml:space="preserve"> PAGEREF _Toc240662340 \h </w:instrText>
         </w:r>
         <w:r>
           <w:rPr>
@@ -961,7 +961,7 @@
           <w14:ligatures w14:val="standardContextual"/>
         </w:rPr>
       </w:pPr>
-      <w:hyperlink w:anchor="_Toc240660969" w:history="1">
+      <w:hyperlink w:anchor="_Toc240662341" w:history="1">
         <w:r>
           <w:rPr>
             <w:rStyle w:val="a6"/>
@@ -988,7 +988,7 @@
             <w:noProof/>
             <w:webHidden/>
           </w:rPr>
-          <w:instrText xml:space="preserve"> PAGEREF _Toc240660969 \h </w:instrText>
+          <w:instrText xml:space="preserve"> PAGEREF _Toc240662341 \h </w:instrText>
         </w:r>
         <w:r>
           <w:rPr>
@@ -1035,7 +1035,7 @@
           <w14:ligatures w14:val="standardContextual"/>
         </w:rPr>
       </w:pPr>
-      <w:hyperlink w:anchor="_Toc240660970" w:history="1">
+      <w:hyperlink w:anchor="_Toc240662342" w:history="1">
         <w:r>
           <w:rPr>
             <w:rStyle w:val="a6"/>
@@ -1062,7 +1062,7 @@
             <w:noProof/>
             <w:webHidden/>
           </w:rPr>
-          <w:instrText xml:space="preserve"> PAGEREF _Toc240660970 \h </w:instrText>
+          <w:instrText xml:space="preserve"> PAGEREF _Toc240662342 \h </w:instrText>
         </w:r>
         <w:r>
           <w:rPr>
@@ -1109,7 +1109,7 @@
           <w14:ligatures w14:val="standardContextual"/>
         </w:rPr>
       </w:pPr>
-      <w:hyperlink w:anchor="_Toc240660971" w:history="1">
+      <w:hyperlink w:anchor="_Toc240662343" w:history="1">
         <w:r>
           <w:rPr>
             <w:rStyle w:val="a6"/>
@@ -1136,7 +1136,7 @@
             <w:noProof/>
             <w:webHidden/>
           </w:rPr>
-          <w:instrText xml:space="preserve"> PAGEREF _Toc240660971 \h </w:instrText>
+          <w:instrText xml:space="preserve"> PAGEREF _Toc240662343 \h </w:instrText>
         </w:r>
         <w:r>
           <w:rPr>
@@ -1183,7 +1183,7 @@
           <w14:ligatures w14:val="standardContextual"/>
         </w:rPr>
       </w:pPr>
-      <w:hyperlink w:anchor="_Toc240660972" w:history="1">
+      <w:hyperlink w:anchor="_Toc240662344" w:history="1">
         <w:r>
           <w:rPr>
             <w:rStyle w:val="a6"/>
@@ -1210,7 +1210,7 @@
             <w:noProof/>
             <w:webHidden/>
           </w:rPr>
-          <w:instrText xml:space="preserve"> PAGEREF _Toc240660972 \h </w:instrText>
+          <w:instrText xml:space="preserve"> PAGEREF _Toc240662344 \h </w:instrText>
         </w:r>
         <w:r>
           <w:rPr>
@@ -1257,7 +1257,7 @@
           <w14:ligatures w14:val="standardContextual"/>
         </w:rPr>
       </w:pPr>
-      <w:hyperlink w:anchor="_Toc240660973" w:history="1">
+      <w:hyperlink w:anchor="_Toc240662345" w:history="1">
         <w:r>
           <w:rPr>
             <w:rStyle w:val="a6"/>
@@ -1284,7 +1284,7 @@
             <w:noProof/>
             <w:webHidden/>
           </w:rPr>
-          <w:instrText xml:space="preserve"> PAGEREF _Toc240660973 \h </w:instrText>
+          <w:instrText xml:space="preserve"> PAGEREF _Toc240662345 \h </w:instrText>
         </w:r>
         <w:r>
           <w:rPr>
@@ -1331,7 +1331,7 @@
           <w14:ligatures w14:val="standardContextual"/>
         </w:rPr>
       </w:pPr>
-      <w:hyperlink w:anchor="_Toc240660974" w:history="1">
+      <w:hyperlink w:anchor="_Toc240662346" w:history="1">
         <w:r>
           <w:rPr>
             <w:rStyle w:val="a6"/>
@@ -1358,7 +1358,7 @@
             <w:noProof/>
             <w:webHidden/>
           </w:rPr>
-          <w:instrText xml:space="preserve"> PAGEREF _Toc240660974 \h </w:instrText>
+          <w:instrText xml:space="preserve"> PAGEREF _Toc240662346 \h </w:instrText>
         </w:r>
         <w:r>
           <w:rPr>
@@ -1405,7 +1405,7 @@
           <w14:ligatures w14:val="standardContextual"/>
         </w:rPr>
       </w:pPr>
-      <w:hyperlink w:anchor="_Toc240660975" w:history="1">
+      <w:hyperlink w:anchor="_Toc240662347" w:history="1">
         <w:r>
           <w:rPr>
             <w:rStyle w:val="a6"/>
@@ -1432,7 +1432,7 @@
             <w:noProof/>
             <w:webHidden/>
           </w:rPr>
-          <w:instrText xml:space="preserve"> PAGEREF _Toc240660975 \h </w:instrText>
+          <w:instrText xml:space="preserve"> PAGEREF _Toc240662347 \h </w:instrText>
         </w:r>
         <w:r>
           <w:rPr>
@@ -1479,7 +1479,7 @@
           <w14:ligatures w14:val="standardContextual"/>
         </w:rPr>
       </w:pPr>
-      <w:hyperlink w:anchor="_Toc240660976" w:history="1">
+      <w:hyperlink w:anchor="_Toc240662348" w:history="1">
         <w:r>
           <w:rPr>
             <w:rStyle w:val="a6"/>
@@ -1506,7 +1506,7 @@
             <w:noProof/>
             <w:webHidden/>
           </w:rPr>
-          <w:instrText xml:space="preserve"> PAGEREF _Toc240660976 \h </w:instrText>
+          <w:instrText xml:space="preserve"> PAGEREF _Toc240662348 \h </w:instrText>
         </w:r>
         <w:r>
           <w:rPr>
@@ -1553,7 +1553,7 @@
           <w14:ligatures w14:val="standardContextual"/>
         </w:rPr>
       </w:pPr>
-      <w:hyperlink w:anchor="_Toc240660977" w:history="1">
+      <w:hyperlink w:anchor="_Toc240662349" w:history="1">
         <w:r>
           <w:rPr>
             <w:rStyle w:val="a6"/>
@@ -1580,7 +1580,7 @@
             <w:noProof/>
             <w:webHidden/>
           </w:rPr>
-          <w:instrText xml:space="preserve"> PAGEREF _Toc240660977 \h </w:instrText>
+          <w:instrText xml:space="preserve"> PAGEREF _Toc240662349 \h </w:instrText>
         </w:r>
         <w:r>
           <w:rPr>
@@ -1627,7 +1627,7 @@
           <w14:ligatures w14:val="standardContextual"/>
         </w:rPr>
       </w:pPr>
-      <w:hyperlink w:anchor="_Toc240660978" w:history="1">
+      <w:hyperlink w:anchor="_Toc240662350" w:history="1">
         <w:r>
           <w:rPr>
             <w:rStyle w:val="a6"/>
@@ -1654,7 +1654,7 @@
             <w:noProof/>
             <w:webHidden/>
           </w:rPr>
-          <w:instrText xml:space="preserve"> PAGEREF _Toc240660978 \h </w:instrText>
+          <w:instrText xml:space="preserve"> PAGEREF _Toc240662350 \h </w:instrText>
         </w:r>
         <w:r>
           <w:rPr>
@@ -1701,7 +1701,7 @@
           <w14:ligatures w14:val="standardContextual"/>
         </w:rPr>
       </w:pPr>
-      <w:hyperlink w:anchor="_Toc240660979" w:history="1">
+      <w:hyperlink w:anchor="_Toc240662351" w:history="1">
         <w:r>
           <w:rPr>
             <w:rStyle w:val="a6"/>
@@ -1728,7 +1728,7 @@
             <w:noProof/>
             <w:webHidden/>
           </w:rPr>
-          <w:instrText xml:space="preserve"> PAGEREF _Toc240660979 \h </w:instrText>
+          <w:instrText xml:space="preserve"> PAGEREF _Toc240662351 \h </w:instrText>
         </w:r>
         <w:r>
           <w:rPr>
@@ -1775,7 +1775,7 @@
           <w14:ligatures w14:val="standardContextual"/>
         </w:rPr>
       </w:pPr>
-      <w:hyperlink w:anchor="_Toc240660980" w:history="1">
+      <w:hyperlink w:anchor="_Toc240662352" w:history="1">
         <w:r>
           <w:rPr>
             <w:rStyle w:val="a6"/>
@@ -1802,7 +1802,7 @@
             <w:noProof/>
             <w:webHidden/>
           </w:rPr>
-          <w:instrText xml:space="preserve"> PAGEREF _Toc240660980 \h </w:instrText>
+          <w:instrText xml:space="preserve"> PAGEREF _Toc240662352 \h </w:instrText>
         </w:r>
         <w:r>
           <w:rPr>
@@ -1849,7 +1849,7 @@
           <w14:ligatures w14:val="standardContextual"/>
         </w:rPr>
       </w:pPr>
-      <w:hyperlink w:anchor="_Toc240660981" w:history="1">
+      <w:hyperlink w:anchor="_Toc240662353" w:history="1">
         <w:r>
           <w:rPr>
             <w:rStyle w:val="a6"/>
@@ -1876,7 +1876,7 @@
             <w:noProof/>
             <w:webHidden/>
           </w:rPr>
-          <w:instrText xml:space="preserve"> PAGEREF _Toc240660981 \h </w:instrText>
+          <w:instrText xml:space="preserve"> PAGEREF _Toc240662353 \h </w:instrText>
         </w:r>
         <w:r>
           <w:rPr>
@@ -1923,7 +1923,7 @@
           <w14:ligatures w14:val="standardContextual"/>
         </w:rPr>
       </w:pPr>
-      <w:hyperlink w:anchor="_Toc240660982" w:history="1">
+      <w:hyperlink w:anchor="_Toc240662354" w:history="1">
         <w:r>
           <w:rPr>
             <w:rStyle w:val="a6"/>
@@ -1950,7 +1950,7 @@
             <w:noProof/>
             <w:webHidden/>
           </w:rPr>
-          <w:instrText xml:space="preserve"> PAGEREF _Toc240660982 \h </w:instrText>
+          <w:instrText xml:space="preserve"> PAGEREF _Toc240662354 \h </w:instrText>
         </w:r>
         <w:r>
           <w:rPr>
@@ -1997,7 +1997,7 @@
           <w14:ligatures w14:val="standardContextual"/>
         </w:rPr>
       </w:pPr>
-      <w:hyperlink w:anchor="_Toc240660983" w:history="1">
+      <w:hyperlink w:anchor="_Toc240662355" w:history="1">
         <w:r>
           <w:rPr>
             <w:rStyle w:val="a6"/>
@@ -2024,7 +2024,7 @@
             <w:noProof/>
             <w:webHidden/>
           </w:rPr>
-          <w:instrText xml:space="preserve"> PAGEREF _Toc240660983 \h </w:instrText>
+          <w:instrText xml:space="preserve"> PAGEREF _Toc240662355 \h </w:instrText>
         </w:r>
         <w:r>
           <w:rPr>
@@ -2071,7 +2071,7 @@
           <w14:ligatures w14:val="standardContextual"/>
         </w:rPr>
       </w:pPr>
-      <w:hyperlink w:anchor="_Toc240660984" w:history="1">
+      <w:hyperlink w:anchor="_Toc240662356" w:history="1">
         <w:r>
           <w:rPr>
             <w:rStyle w:val="a6"/>
@@ -2098,7 +2098,7 @@
             <w:noProof/>
             <w:webHidden/>
           </w:rPr>
-          <w:instrText xml:space="preserve"> PAGEREF _Toc240660984 \h </w:instrText>
+          <w:instrText xml:space="preserve"> PAGEREF _Toc240662356 \h </w:instrText>
         </w:r>
         <w:r>
           <w:rPr>
@@ -2145,7 +2145,7 @@
           <w14:ligatures w14:val="standardContextual"/>
         </w:rPr>
       </w:pPr>
-      <w:hyperlink w:anchor="_Toc240660985" w:history="1">
+      <w:hyperlink w:anchor="_Toc240662357" w:history="1">
         <w:r>
           <w:rPr>
             <w:rStyle w:val="a6"/>
@@ -2172,7 +2172,7 @@
             <w:noProof/>
             <w:webHidden/>
           </w:rPr>
-          <w:instrText xml:space="preserve"> PAGEREF _Toc240660985 \h </w:instrText>
+          <w:instrText xml:space="preserve"> PAGEREF _Toc240662357 \h </w:instrText>
         </w:r>
         <w:r>
           <w:rPr>
@@ -2219,7 +2219,7 @@
           <w14:ligatures w14:val="standardContextual"/>
         </w:rPr>
       </w:pPr>
-      <w:hyperlink w:anchor="_Toc240660986" w:history="1">
+      <w:hyperlink w:anchor="_Toc240662358" w:history="1">
         <w:r>
           <w:rPr>
             <w:rStyle w:val="a6"/>
@@ -2246,7 +2246,7 @@
             <w:noProof/>
             <w:webHidden/>
           </w:rPr>
-          <w:instrText xml:space="preserve"> PAGEREF _Toc240660986 \h </w:instrText>
+          <w:instrText xml:space="preserve"> PAGEREF _Toc240662358 \h </w:instrText>
         </w:r>
         <w:r>
           <w:rPr>
@@ -2293,7 +2293,7 @@
           <w14:ligatures w14:val="standardContextual"/>
         </w:rPr>
       </w:pPr>
-      <w:hyperlink w:anchor="_Toc240660987" w:history="1">
+      <w:hyperlink w:anchor="_Toc240662359" w:history="1">
         <w:r>
           <w:rPr>
             <w:rStyle w:val="a6"/>
@@ -2320,7 +2320,7 @@
             <w:noProof/>
             <w:webHidden/>
           </w:rPr>
-          <w:instrText xml:space="preserve"> PAGEREF _Toc240660987 \h </w:instrText>
+          <w:instrText xml:space="preserve"> PAGEREF _Toc240662359 \h </w:instrText>
         </w:r>
         <w:r>
           <w:rPr>
@@ -2367,7 +2367,7 @@
           <w14:ligatures w14:val="standardContextual"/>
         </w:rPr>
       </w:pPr>
-      <w:hyperlink w:anchor="_Toc240660988" w:history="1">
+      <w:hyperlink w:anchor="_Toc240662360" w:history="1">
         <w:r>
           <w:rPr>
             <w:rStyle w:val="a6"/>
@@ -2394,7 +2394,7 @@
             <w:noProof/>
             <w:webHidden/>
           </w:rPr>
-          <w:instrText xml:space="preserve"> PAGEREF _Toc240660988 \h </w:instrText>
+          <w:instrText xml:space="preserve"> PAGEREF _Toc240662360 \h </w:instrText>
         </w:r>
         <w:r>
           <w:rPr>
@@ -2441,7 +2441,7 @@
           <w14:ligatures w14:val="standardContextual"/>
         </w:rPr>
       </w:pPr>
-      <w:hyperlink w:anchor="_Toc240660989" w:history="1">
+      <w:hyperlink w:anchor="_Toc240662361" w:history="1">
         <w:r>
           <w:rPr>
             <w:rStyle w:val="a6"/>
@@ -2468,7 +2468,7 @@
             <w:noProof/>
             <w:webHidden/>
           </w:rPr>
-          <w:instrText xml:space="preserve"> PAGEREF _Toc240660989 \h </w:instrText>
+          <w:instrText xml:space="preserve"> PAGEREF _Toc240662361 \h </w:instrText>
         </w:r>
         <w:r>
           <w:rPr>
@@ -2515,7 +2515,7 @@
           <w14:ligatures w14:val="standardContextual"/>
         </w:rPr>
       </w:pPr>
-      <w:hyperlink w:anchor="_Toc240660990" w:history="1">
+      <w:hyperlink w:anchor="_Toc240662362" w:history="1">
         <w:r>
           <w:rPr>
             <w:rStyle w:val="a6"/>
@@ -2542,7 +2542,7 @@
             <w:noProof/>
             <w:webHidden/>
           </w:rPr>
-          <w:instrText xml:space="preserve"> PAGEREF _Toc240660990 \h </w:instrText>
+          <w:instrText xml:space="preserve"> PAGEREF _Toc240662362 \h </w:instrText>
         </w:r>
         <w:r>
           <w:rPr>
@@ -2589,7 +2589,7 @@
           <w14:ligatures w14:val="standardContextual"/>
         </w:rPr>
       </w:pPr>
-      <w:hyperlink w:anchor="_Toc240660991" w:history="1">
+      <w:hyperlink w:anchor="_Toc240662363" w:history="1">
         <w:r>
           <w:rPr>
             <w:rStyle w:val="a6"/>
@@ -2616,7 +2616,7 @@
             <w:noProof/>
             <w:webHidden/>
           </w:rPr>
-          <w:instrText xml:space="preserve"> PAGEREF _Toc240660991 \h </w:instrText>
+          <w:instrText xml:space="preserve"> PAGEREF _Toc240662363 \h </w:instrText>
         </w:r>
         <w:r>
           <w:rPr>
@@ -2663,7 +2663,7 @@
           <w14:ligatures w14:val="standardContextual"/>
         </w:rPr>
       </w:pPr>
-      <w:hyperlink w:anchor="_Toc240660992" w:history="1">
+      <w:hyperlink w:anchor="_Toc240662364" w:history="1">
         <w:r>
           <w:rPr>
             <w:rStyle w:val="a6"/>
@@ -2690,7 +2690,7 @@
             <w:noProof/>
             <w:webHidden/>
           </w:rPr>
-          <w:instrText xml:space="preserve"> PAGEREF _Toc240660992 \h </w:instrText>
+          <w:instrText xml:space="preserve"> PAGEREF _Toc240662364 \h </w:instrText>
         </w:r>
         <w:r>
           <w:rPr>
@@ -2737,7 +2737,7 @@
           <w14:ligatures w14:val="standardContextual"/>
         </w:rPr>
       </w:pPr>
-      <w:hyperlink w:anchor="_Toc240660993" w:history="1">
+      <w:hyperlink w:anchor="_Toc240662365" w:history="1">
         <w:r>
           <w:rPr>
             <w:rStyle w:val="a6"/>
@@ -2764,7 +2764,7 @@
             <w:noProof/>
             <w:webHidden/>
           </w:rPr>
-          <w:instrText xml:space="preserve"> PAGEREF _Toc240660993 \h </w:instrText>
+          <w:instrText xml:space="preserve"> PAGEREF _Toc240662365 \h </w:instrText>
         </w:r>
         <w:r>
           <w:rPr>
@@ -2811,7 +2811,7 @@
           <w14:ligatures w14:val="standardContextual"/>
         </w:rPr>
       </w:pPr>
-      <w:hyperlink w:anchor="_Toc240660994" w:history="1">
+      <w:hyperlink w:anchor="_Toc240662366" w:history="1">
         <w:r>
           <w:rPr>
             <w:rStyle w:val="a6"/>
@@ -2838,7 +2838,7 @@
             <w:noProof/>
             <w:webHidden/>
           </w:rPr>
-          <w:instrText xml:space="preserve"> PAGEREF _Toc240660994 \h </w:instrText>
+          <w:instrText xml:space="preserve"> PAGEREF _Toc240662366 \h </w:instrText>
         </w:r>
         <w:r>
           <w:rPr>
@@ -2885,7 +2885,7 @@
           <w14:ligatures w14:val="standardContextual"/>
         </w:rPr>
       </w:pPr>
-      <w:hyperlink w:anchor="_Toc240660995" w:history="1">
+      <w:hyperlink w:anchor="_Toc240662367" w:history="1">
         <w:r>
           <w:rPr>
             <w:rStyle w:val="a6"/>
@@ -2912,7 +2912,7 @@
             <w:noProof/>
             <w:webHidden/>
           </w:rPr>
-          <w:instrText xml:space="preserve"> PAGEREF _Toc240660995 \h </w:instrText>
+          <w:instrText xml:space="preserve"> PAGEREF _Toc240662367 \h </w:instrText>
         </w:r>
         <w:r>
           <w:rPr>
@@ -2959,7 +2959,7 @@
           <w14:ligatures w14:val="standardContextual"/>
         </w:rPr>
       </w:pPr>
-      <w:hyperlink w:anchor="_Toc240660996" w:history="1">
+      <w:hyperlink w:anchor="_Toc240662368" w:history="1">
         <w:r>
           <w:rPr>
             <w:rStyle w:val="a6"/>
@@ -2986,7 +2986,7 @@
             <w:noProof/>
             <w:webHidden/>
           </w:rPr>
-          <w:instrText xml:space="preserve"> PAGEREF _Toc240660996 \h </w:instrText>
+          <w:instrText xml:space="preserve"> PAGEREF _Toc240662368 \h </w:instrText>
         </w:r>
         <w:r>
           <w:rPr>
@@ -3033,7 +3033,7 @@
           <w14:ligatures w14:val="standardContextual"/>
         </w:rPr>
       </w:pPr>
-      <w:hyperlink w:anchor="_Toc240660997" w:history="1">
+      <w:hyperlink w:anchor="_Toc240662369" w:history="1">
         <w:r>
           <w:rPr>
             <w:rStyle w:val="a6"/>
@@ -3060,7 +3060,7 @@
             <w:noProof/>
             <w:webHidden/>
           </w:rPr>
-          <w:instrText xml:space="preserve"> PAGEREF _Toc240660997 \h </w:instrText>
+          <w:instrText xml:space="preserve"> PAGEREF _Toc240662369 \h </w:instrText>
         </w:r>
         <w:r>
           <w:rPr>
@@ -3107,7 +3107,7 @@
           <w14:ligatures w14:val="standardContextual"/>
         </w:rPr>
       </w:pPr>
-      <w:hyperlink w:anchor="_Toc240660998" w:history="1">
+      <w:hyperlink w:anchor="_Toc240662370" w:history="1">
         <w:r>
           <w:rPr>
             <w:rStyle w:val="a6"/>
@@ -3134,7 +3134,7 @@
             <w:noProof/>
             <w:webHidden/>
           </w:rPr>
-          <w:instrText xml:space="preserve"> PAGEREF _Toc240660998 \h </w:instrText>
+          <w:instrText xml:space="preserve"> PAGEREF _Toc240662370 \h </w:instrText>
         </w:r>
         <w:r>
           <w:rPr>
@@ -3181,7 +3181,7 @@
           <w14:ligatures w14:val="standardContextual"/>
         </w:rPr>
       </w:pPr>
-      <w:hyperlink w:anchor="_Toc240660999" w:history="1">
+      <w:hyperlink w:anchor="_Toc240662371" w:history="1">
         <w:r>
           <w:rPr>
             <w:rStyle w:val="a6"/>
@@ -3208,7 +3208,7 @@
             <w:noProof/>
             <w:webHidden/>
           </w:rPr>
-          <w:instrText xml:space="preserve"> PAGEREF _Toc240660999 \h </w:instrText>
+          <w:instrText xml:space="preserve"> PAGEREF _Toc240662371 \h </w:instrText>
         </w:r>
         <w:r>
           <w:rPr>
@@ -3255,7 +3255,7 @@
           <w14:ligatures w14:val="standardContextual"/>
         </w:rPr>
       </w:pPr>
-      <w:hyperlink w:anchor="_Toc240661000" w:history="1">
+      <w:hyperlink w:anchor="_Toc240662372" w:history="1">
         <w:r>
           <w:rPr>
             <w:rStyle w:val="a6"/>
@@ -3282,7 +3282,7 @@
             <w:noProof/>
             <w:webHidden/>
           </w:rPr>
-          <w:instrText xml:space="preserve"> PAGEREF _Toc240661000 \h </w:instrText>
+          <w:instrText xml:space="preserve"> PAGEREF _Toc240662372 \h </w:instrText>
         </w:r>
         <w:r>
           <w:rPr>
@@ -3329,7 +3329,7 @@
           <w14:ligatures w14:val="standardContextual"/>
         </w:rPr>
       </w:pPr>
-      <w:hyperlink w:anchor="_Toc240661001" w:history="1">
+      <w:hyperlink w:anchor="_Toc240662373" w:history="1">
         <w:r>
           <w:rPr>
             <w:rStyle w:val="a6"/>
@@ -3356,7 +3356,7 @@
             <w:noProof/>
             <w:webHidden/>
           </w:rPr>
-          <w:instrText xml:space="preserve"> PAGEREF _Toc240661001 \h </w:instrText>
+          <w:instrText xml:space="preserve"> PAGEREF _Toc240662373 \h </w:instrText>
         </w:r>
         <w:r>
           <w:rPr>
@@ -3403,7 +3403,7 @@
           <w14:ligatures w14:val="standardContextual"/>
         </w:rPr>
       </w:pPr>
-      <w:hyperlink w:anchor="_Toc240661002" w:history="1">
+      <w:hyperlink w:anchor="_Toc240662374" w:history="1">
         <w:r>
           <w:rPr>
             <w:rStyle w:val="a6"/>
@@ -3430,7 +3430,7 @@
             <w:noProof/>
             <w:webHidden/>
           </w:rPr>
-          <w:instrText xml:space="preserve"> PAGEREF _Toc240661002 \h </w:instrText>
+          <w:instrText xml:space="preserve"> PAGEREF _Toc240662374 \h </w:instrText>
         </w:r>
         <w:r>
           <w:rPr>
@@ -3477,7 +3477,7 @@
           <w14:ligatures w14:val="standardContextual"/>
         </w:rPr>
       </w:pPr>
-      <w:hyperlink w:anchor="_Toc240661003" w:history="1">
+      <w:hyperlink w:anchor="_Toc240662375" w:history="1">
         <w:r>
           <w:rPr>
             <w:rStyle w:val="a6"/>
@@ -3504,7 +3504,7 @@
             <w:noProof/>
             <w:webHidden/>
           </w:rPr>
-          <w:instrText xml:space="preserve"> PAGEREF _Toc240661003 \h </w:instrText>
+          <w:instrText xml:space="preserve"> PAGEREF _Toc240662375 \h </w:instrText>
         </w:r>
         <w:r>
           <w:rPr>
@@ -3551,7 +3551,7 @@
           <w14:ligatures w14:val="standardContextual"/>
         </w:rPr>
       </w:pPr>
-      <w:hyperlink w:anchor="_Toc240661004" w:history="1">
+      <w:hyperlink w:anchor="_Toc240662376" w:history="1">
         <w:r>
           <w:rPr>
             <w:rStyle w:val="a6"/>
@@ -3578,7 +3578,7 @@
             <w:noProof/>
             <w:webHidden/>
           </w:rPr>
-          <w:instrText xml:space="preserve"> PAGEREF _Toc240661004 \h </w:instrText>
+          <w:instrText xml:space="preserve"> PAGEREF _Toc240662376 \h </w:instrText>
         </w:r>
         <w:r>
           <w:rPr>
@@ -3625,7 +3625,7 @@
           <w14:ligatures w14:val="standardContextual"/>
         </w:rPr>
       </w:pPr>
-      <w:hyperlink w:anchor="_Toc240661005" w:history="1">
+      <w:hyperlink w:anchor="_Toc240662377" w:history="1">
         <w:r>
           <w:rPr>
             <w:rStyle w:val="a6"/>
@@ -3652,7 +3652,7 @@
             <w:noProof/>
             <w:webHidden/>
           </w:rPr>
-          <w:instrText xml:space="preserve"> PAGEREF _Toc240661005 \h </w:instrText>
+          <w:instrText xml:space="preserve"> PAGEREF _Toc240662377 \h </w:instrText>
         </w:r>
         <w:r>
           <w:rPr>
@@ -3699,7 +3699,7 @@
           <w14:ligatures w14:val="standardContextual"/>
         </w:rPr>
       </w:pPr>
-      <w:hyperlink w:anchor="_Toc240661006" w:history="1">
+      <w:hyperlink w:anchor="_Toc240662378" w:history="1">
         <w:r>
           <w:rPr>
             <w:rStyle w:val="a6"/>
@@ -3726,7 +3726,7 @@
             <w:noProof/>
             <w:webHidden/>
           </w:rPr>
-          <w:instrText xml:space="preserve"> PAGEREF _Toc240661006 \h </w:instrText>
+          <w:instrText xml:space="preserve"> PAGEREF _Toc240662378 \h </w:instrText>
         </w:r>
         <w:r>
           <w:rPr>
@@ -3773,7 +3773,7 @@
           <w14:ligatures w14:val="standardContextual"/>
         </w:rPr>
       </w:pPr>
-      <w:hyperlink w:anchor="_Toc240661007" w:history="1">
+      <w:hyperlink w:anchor="_Toc240662379" w:history="1">
         <w:r>
           <w:rPr>
             <w:rStyle w:val="a6"/>
@@ -3800,7 +3800,7 @@
             <w:noProof/>
             <w:webHidden/>
           </w:rPr>
-          <w:instrText xml:space="preserve"> PAGEREF _Toc240661007 \h </w:instrText>
+          <w:instrText xml:space="preserve"> PAGEREF _Toc240662379 \h </w:instrText>
         </w:r>
         <w:r>
           <w:rPr>
@@ -3847,7 +3847,7 @@
           <w14:ligatures w14:val="standardContextual"/>
         </w:rPr>
       </w:pPr>
-      <w:hyperlink w:anchor="_Toc240661008" w:history="1">
+      <w:hyperlink w:anchor="_Toc240662380" w:history="1">
         <w:r>
           <w:rPr>
             <w:rStyle w:val="a6"/>
@@ -3874,7 +3874,7 @@
             <w:noProof/>
             <w:webHidden/>
           </w:rPr>
-          <w:instrText xml:space="preserve"> PAGEREF _Toc240661008 \h </w:instrText>
+          <w:instrText xml:space="preserve"> PAGEREF _Toc240662380 \h </w:instrText>
         </w:r>
         <w:r>
           <w:rPr>
@@ -3921,7 +3921,7 @@
           <w14:ligatures w14:val="standardContextual"/>
         </w:rPr>
       </w:pPr>
-      <w:hyperlink w:anchor="_Toc240661009" w:history="1">
+      <w:hyperlink w:anchor="_Toc240662381" w:history="1">
         <w:r>
           <w:rPr>
             <w:rStyle w:val="a6"/>
@@ -3948,7 +3948,7 @@
             <w:noProof/>
             <w:webHidden/>
           </w:rPr>
-          <w:instrText xml:space="preserve"> PAGEREF _Toc240661009 \h </w:instrText>
+          <w:instrText xml:space="preserve"> PAGEREF _Toc240662381 \h </w:instrText>
         </w:r>
         <w:r>
           <w:rPr>
@@ -3995,7 +3995,7 @@
           <w14:ligatures w14:val="standardContextual"/>
         </w:rPr>
       </w:pPr>
-      <w:hyperlink w:anchor="_Toc240661010" w:history="1">
+      <w:hyperlink w:anchor="_Toc240662382" w:history="1">
         <w:r>
           <w:rPr>
             <w:rStyle w:val="a6"/>
@@ -4022,7 +4022,7 @@
             <w:noProof/>
             <w:webHidden/>
           </w:rPr>
-          <w:instrText xml:space="preserve"> PAGEREF _Toc240661010 \h </w:instrText>
+          <w:instrText xml:space="preserve"> PAGEREF _Toc240662382 \h </w:instrText>
         </w:r>
         <w:r>
           <w:rPr>
@@ -4069,7 +4069,7 @@
           <w14:ligatures w14:val="standardContextual"/>
         </w:rPr>
       </w:pPr>
-      <w:hyperlink w:anchor="_Toc240661011" w:history="1">
+      <w:hyperlink w:anchor="_Toc240662383" w:history="1">
         <w:r>
           <w:rPr>
             <w:rStyle w:val="a6"/>
@@ -4096,7 +4096,7 @@
             <w:noProof/>
             <w:webHidden/>
           </w:rPr>
-          <w:instrText xml:space="preserve"> PAGEREF _Toc240661011 \h </w:instrText>
+          <w:instrText xml:space="preserve"> PAGEREF _Toc240662383 \h </w:instrText>
         </w:r>
         <w:r>
           <w:rPr>
@@ -4143,7 +4143,7 @@
           <w14:ligatures w14:val="standardContextual"/>
         </w:rPr>
       </w:pPr>
-      <w:hyperlink w:anchor="_Toc240661012" w:history="1">
+      <w:hyperlink w:anchor="_Toc240662384" w:history="1">
         <w:r>
           <w:rPr>
             <w:rStyle w:val="a6"/>
@@ -4170,7 +4170,7 @@
             <w:noProof/>
             <w:webHidden/>
           </w:rPr>
-          <w:instrText xml:space="preserve"> PAGEREF _Toc240661012 \h </w:instrText>
+          <w:instrText xml:space="preserve"> PAGEREF _Toc240662384 \h </w:instrText>
         </w:r>
         <w:r>
           <w:rPr>
@@ -4217,7 +4217,7 @@
           <w14:ligatures w14:val="standardContextual"/>
         </w:rPr>
       </w:pPr>
-      <w:hyperlink w:anchor="_Toc240661013" w:history="1">
+      <w:hyperlink w:anchor="_Toc240662385" w:history="1">
         <w:r>
           <w:rPr>
             <w:rStyle w:val="a6"/>
@@ -4244,7 +4244,7 @@
             <w:noProof/>
             <w:webHidden/>
           </w:rPr>
-          <w:instrText xml:space="preserve"> PAGEREF _Toc240661013 \h </w:instrText>
+          <w:instrText xml:space="preserve"> PAGEREF _Toc240662385 \h </w:instrText>
         </w:r>
         <w:r>
           <w:rPr>
@@ -4289,7 +4289,7 @@
         <w:pStyle w:val="1"/>
         <w:pageBreakBefore/>
       </w:pPr>
-      <w:bookmarkStart w:id="0" w:name="_Toc240660960"/>
+      <w:bookmarkStart w:id="0" w:name="_Toc240662332"/>
       <w:r>
         <w:lastRenderedPageBreak/>
         <w:t>Аннотация</w:t>
@@ -4413,7 +4413,7 @@
         <w:pStyle w:val="1"/>
         <w:pageBreakBefore/>
       </w:pPr>
-      <w:bookmarkStart w:id="1" w:name="_Toc240660961"/>
+      <w:bookmarkStart w:id="1" w:name="_Toc240662333"/>
       <w:r>
         <w:lastRenderedPageBreak/>
         <w:t>Описание применения генеративной модели</w:t>
@@ -4448,7 +4448,7 @@
         <w:pStyle w:val="1"/>
         <w:pageBreakBefore/>
       </w:pPr>
-      <w:bookmarkStart w:id="2" w:name="_Toc240660962"/>
+      <w:bookmarkStart w:id="2" w:name="_Toc240662334"/>
       <w:r>
         <w:lastRenderedPageBreak/>
         <w:t>Введение</w:t>
@@ -4459,7 +4459,7 @@
       <w:pPr>
         <w:pStyle w:val="21"/>
       </w:pPr>
-      <w:bookmarkStart w:id="3" w:name="_Toc240660963"/>
+      <w:bookmarkStart w:id="3" w:name="_Toc240662335"/>
       <w:r>
         <w:rPr>
           <w:rFonts w:cs="Times New Roman"/>
@@ -4510,7 +4510,7 @@
       <w:pPr>
         <w:pStyle w:val="21"/>
       </w:pPr>
-      <w:bookmarkStart w:id="4" w:name="_Toc240660964"/>
+      <w:bookmarkStart w:id="4" w:name="_Toc240662336"/>
       <w:r>
         <w:rPr>
           <w:rFonts w:cs="Times New Roman"/>
@@ -4688,7 +4688,7 @@
       <w:pPr>
         <w:pStyle w:val="21"/>
       </w:pPr>
-      <w:bookmarkStart w:id="5" w:name="_Toc240660965"/>
+      <w:bookmarkStart w:id="5" w:name="_Toc240662337"/>
       <w:r>
         <w:rPr>
           <w:rFonts w:cs="Times New Roman"/>
@@ -4711,7 +4711,7 @@
       <w:pPr>
         <w:pStyle w:val="21"/>
       </w:pPr>
-      <w:bookmarkStart w:id="6" w:name="_Toc240660966"/>
+      <w:bookmarkStart w:id="6" w:name="_Toc240662338"/>
       <w:r>
         <w:rPr>
           <w:rFonts w:cs="Times New Roman"/>
@@ -4763,7 +4763,7 @@
       <w:pPr>
         <w:pStyle w:val="21"/>
       </w:pPr>
-      <w:bookmarkStart w:id="7" w:name="_Toc240660967"/>
+      <w:bookmarkStart w:id="7" w:name="_Toc240662339"/>
       <w:r>
         <w:rPr>
           <w:rFonts w:cs="Times New Roman"/>
@@ -4808,10 +4808,23 @@
       </w:r>
     </w:p>
     <w:p>
+      <w:r>
+        <w:t xml:space="preserve">Исходный код реализации, тесты и материалы воспроизводимой проверки опубликованы в репозитории курсового проекта: </w:t>
+      </w:r>
+      <w:hyperlink r:id="rId13">
+        <w:r>
+          <w:t>https://github.com/shumakovaes/ClickHouse/tree/coursework/time-series-extensions/coursework</w:t>
+        </w:r>
+      </w:hyperlink>
+      <w:r>
+        <w:t xml:space="preserve"> (дата обращения: 18.09.2026).</w:t>
+      </w:r>
+    </w:p>
+    <w:p>
       <w:pPr>
         <w:pStyle w:val="21"/>
       </w:pPr>
-      <w:bookmarkStart w:id="8" w:name="_Toc240660968"/>
+      <w:bookmarkStart w:id="8" w:name="_Toc240662340"/>
       <w:r>
         <w:rPr>
           <w:rFonts w:cs="Times New Roman"/>
@@ -4833,7 +4846,7 @@
         <w:pStyle w:val="1"/>
         <w:pageBreakBefore/>
       </w:pPr>
-      <w:bookmarkStart w:id="9" w:name="_Toc240660969"/>
+      <w:bookmarkStart w:id="9" w:name="_Toc240662341"/>
       <w:r>
         <w:lastRenderedPageBreak/>
         <w:t>Обзор литературы и аналогов</w:t>
@@ -4844,7 +4857,7 @@
       <w:pPr>
         <w:pStyle w:val="21"/>
       </w:pPr>
-      <w:bookmarkStart w:id="10" w:name="_Toc240660970"/>
+      <w:bookmarkStart w:id="10" w:name="_Toc240662342"/>
       <w:r>
         <w:rPr>
           <w:rFonts w:cs="Times New Roman"/>
@@ -4887,7 +4900,7 @@
       <w:pPr>
         <w:pStyle w:val="21"/>
       </w:pPr>
-      <w:bookmarkStart w:id="11" w:name="_Toc240660971"/>
+      <w:bookmarkStart w:id="11" w:name="_Toc240662343"/>
       <w:r>
         <w:rPr>
           <w:rFonts w:cs="Times New Roman"/>
@@ -4942,7 +4955,7 @@
       <w:pPr>
         <w:pStyle w:val="21"/>
       </w:pPr>
-      <w:bookmarkStart w:id="12" w:name="_Toc240660972"/>
+      <w:bookmarkStart w:id="12" w:name="_Toc240662344"/>
       <w:r>
         <w:rPr>
           <w:rFonts w:cs="Times New Roman"/>
@@ -4969,7 +4982,7 @@
       <w:pPr>
         <w:pStyle w:val="21"/>
       </w:pPr>
-      <w:bookmarkStart w:id="13" w:name="_Toc240660973"/>
+      <w:bookmarkStart w:id="13" w:name="_Toc240662345"/>
       <w:r>
         <w:rPr>
           <w:rFonts w:cs="Times New Roman"/>
@@ -4993,7 +5006,7 @@
         <w:pStyle w:val="1"/>
         <w:pageBreakBefore/>
       </w:pPr>
-      <w:bookmarkStart w:id="14" w:name="_Toc240660974"/>
+      <w:bookmarkStart w:id="14" w:name="_Toc240662346"/>
       <w:r>
         <w:lastRenderedPageBreak/>
         <w:t>Глава 1. Постановка задачи и контракт входных данных</w:t>
@@ -5004,7 +5017,7 @@
       <w:pPr>
         <w:pStyle w:val="21"/>
       </w:pPr>
-      <w:bookmarkStart w:id="15" w:name="_Toc240660975"/>
+      <w:bookmarkStart w:id="15" w:name="_Toc240662347"/>
       <w:r>
         <w:rPr>
           <w:rFonts w:cs="Times New Roman"/>
@@ -5077,7 +5090,7 @@
                 <w:noProof/>
               </w:rPr>
               <w:drawing>
-                <wp:inline distT="0" distB="0" distL="0" distR="0" wp14:anchorId="0FF58FAE" wp14:editId="5A95B231">
+                <wp:inline distT="0" distB="0" distL="0" distR="0" wp14:anchorId="6FD29E57" wp14:editId="7E11573A">
                   <wp:extent cx="4892040" cy="243199"/>
                   <wp:effectExtent l="0" t="0" r="0" b="0"/>
                   <wp:docPr id="1" name="Picture 1"/>
@@ -5092,7 +5105,7 @@
                           <pic:cNvPicPr/>
                         </pic:nvPicPr>
                         <pic:blipFill>
-                          <a:blip r:embed="rId13"/>
+                          <a:blip r:embed="rId14"/>
                           <a:stretch>
                             <a:fillRect/>
                           </a:stretch>
@@ -5231,7 +5244,7 @@
       <w:pPr>
         <w:pStyle w:val="21"/>
       </w:pPr>
-      <w:bookmarkStart w:id="16" w:name="_Toc240660976"/>
+      <w:bookmarkStart w:id="16" w:name="_Toc240662348"/>
       <w:r>
         <w:rPr>
           <w:rFonts w:cs="Times New Roman"/>
@@ -5274,7 +5287,7 @@
       <w:pPr>
         <w:pStyle w:val="21"/>
       </w:pPr>
-      <w:bookmarkStart w:id="17" w:name="_Toc240660977"/>
+      <w:bookmarkStart w:id="17" w:name="_Toc240662349"/>
       <w:r>
         <w:rPr>
           <w:rFonts w:cs="Times New Roman"/>
@@ -6116,7 +6129,7 @@
       <w:pPr>
         <w:pStyle w:val="21"/>
       </w:pPr>
-      <w:bookmarkStart w:id="18" w:name="_Toc240660978"/>
+      <w:bookmarkStart w:id="18" w:name="_Toc240662350"/>
       <w:r>
         <w:rPr>
           <w:rFonts w:cs="Times New Roman"/>
@@ -6190,7 +6203,7 @@
         <w:pStyle w:val="1"/>
         <w:pageBreakBefore/>
       </w:pPr>
-      <w:bookmarkStart w:id="19" w:name="_Toc240660979"/>
+      <w:bookmarkStart w:id="19" w:name="_Toc240662351"/>
       <w:r>
         <w:lastRenderedPageBreak/>
         <w:t>Глава 2. Архитектура объединяемого состояния и доказательство корректности</w:t>
@@ -6201,7 +6214,7 @@
       <w:pPr>
         <w:pStyle w:val="21"/>
       </w:pPr>
-      <w:bookmarkStart w:id="20" w:name="_Toc240660980"/>
+      <w:bookmarkStart w:id="20" w:name="_Toc240662352"/>
       <w:r>
         <w:rPr>
           <w:rFonts w:cs="Times New Roman"/>
@@ -6244,7 +6257,7 @@
       <w:pPr>
         <w:pStyle w:val="21"/>
       </w:pPr>
-      <w:bookmarkStart w:id="21" w:name="_Toc240660981"/>
+      <w:bookmarkStart w:id="21" w:name="_Toc240662353"/>
       <w:r>
         <w:rPr>
           <w:rFonts w:cs="Times New Roman"/>
@@ -6327,7 +6340,7 @@
                 <w:noProof/>
               </w:rPr>
               <w:drawing>
-                <wp:inline distT="0" distB="0" distL="0" distR="0" wp14:anchorId="3BE1F38B" wp14:editId="6648EAFE">
+                <wp:inline distT="0" distB="0" distL="0" distR="0" wp14:anchorId="7A4C545D" wp14:editId="5D4D5D35">
                   <wp:extent cx="5166360" cy="555157"/>
                   <wp:effectExtent l="0" t="0" r="0" b="0"/>
                   <wp:docPr id="2" name="Picture 2"/>
@@ -6342,7 +6355,7 @@
                           <pic:cNvPicPr/>
                         </pic:nvPicPr>
                         <pic:blipFill>
-                          <a:blip r:embed="rId14"/>
+                          <a:blip r:embed="rId15"/>
                           <a:stretch>
                             <a:fillRect/>
                           </a:stretch>
@@ -6416,7 +6429,7 @@
       <w:pPr>
         <w:pStyle w:val="21"/>
       </w:pPr>
-      <w:bookmarkStart w:id="22" w:name="_Toc240660982"/>
+      <w:bookmarkStart w:id="22" w:name="_Toc240662354"/>
       <w:r>
         <w:rPr>
           <w:rFonts w:cs="Times New Roman"/>
@@ -6498,7 +6511,7 @@
       <w:pPr>
         <w:pStyle w:val="21"/>
       </w:pPr>
-      <w:bookmarkStart w:id="23" w:name="_Toc240660983"/>
+      <w:bookmarkStart w:id="23" w:name="_Toc240662355"/>
       <w:r>
         <w:rPr>
           <w:rFonts w:cs="Times New Roman"/>
@@ -6609,7 +6622,7 @@
       <w:pPr>
         <w:pStyle w:val="21"/>
       </w:pPr>
-      <w:bookmarkStart w:id="24" w:name="_Toc240660984"/>
+      <w:bookmarkStart w:id="24" w:name="_Toc240662356"/>
       <w:r>
         <w:rPr>
           <w:rFonts w:cs="Times New Roman"/>
@@ -6820,7 +6833,7 @@
                 <w:noProof/>
               </w:rPr>
               <w:drawing>
-                <wp:inline distT="0" distB="0" distL="0" distR="0" wp14:anchorId="166C07C4" wp14:editId="4972967C">
+                <wp:inline distT="0" distB="0" distL="0" distR="0" wp14:anchorId="7BFDA9F8" wp14:editId="4D6E88A1">
                   <wp:extent cx="2880360" cy="1071762"/>
                   <wp:effectExtent l="0" t="0" r="0" b="0"/>
                   <wp:docPr id="3" name="Picture 3"/>
@@ -6835,7 +6848,7 @@
                           <pic:cNvPicPr/>
                         </pic:nvPicPr>
                         <pic:blipFill>
-                          <a:blip r:embed="rId15"/>
+                          <a:blip r:embed="rId16"/>
                           <a:stretch>
                             <a:fillRect/>
                           </a:stretch>
@@ -7133,7 +7146,7 @@
         </w:rPr>
         <w:lastRenderedPageBreak/>
         <w:drawing>
-          <wp:inline distT="0" distB="0" distL="0" distR="0" wp14:anchorId="4C03FA4C" wp14:editId="4FA61AFD">
+          <wp:inline distT="0" distB="0" distL="0" distR="0" wp14:anchorId="247C53F1" wp14:editId="50AD1B04">
             <wp:extent cx="6080760" cy="1894007"/>
             <wp:effectExtent l="0" t="0" r="0" b="0"/>
             <wp:docPr id="4" name="Picture 4" descr="Рисунок 1 - Поток данных и канонизация состояния агрегата"/>
@@ -7148,7 +7161,7 @@
                     <pic:cNvPicPr/>
                   </pic:nvPicPr>
                   <pic:blipFill>
-                    <a:blip r:embed="rId16"/>
+                    <a:blip r:embed="rId17"/>
                     <a:stretch>
                       <a:fillRect/>
                     </a:stretch>
@@ -7184,7 +7197,7 @@
       <w:pPr>
         <w:pStyle w:val="21"/>
       </w:pPr>
-      <w:bookmarkStart w:id="25" w:name="_Toc240660985"/>
+      <w:bookmarkStart w:id="25" w:name="_Toc240662357"/>
       <w:r>
         <w:rPr>
           <w:rFonts w:cs="Times New Roman"/>
@@ -8253,7 +8266,7 @@
         <w:pStyle w:val="1"/>
         <w:pageBreakBefore/>
       </w:pPr>
-      <w:bookmarkStart w:id="26" w:name="_Toc240660986"/>
+      <w:bookmarkStart w:id="26" w:name="_Toc240662358"/>
       <w:r>
         <w:lastRenderedPageBreak/>
         <w:t>Глава 3. API и алгоритмы четырёх расширений</w:t>
@@ -8264,7 +8277,7 @@
       <w:pPr>
         <w:pStyle w:val="21"/>
       </w:pPr>
-      <w:bookmarkStart w:id="27" w:name="_Toc240660987"/>
+      <w:bookmarkStart w:id="27" w:name="_Toc240662359"/>
       <w:r>
         <w:rPr>
           <w:rFonts w:cs="Times New Roman"/>
@@ -8282,7 +8295,7 @@
       <w:pPr>
         <w:pStyle w:val="21"/>
       </w:pPr>
-      <w:bookmarkStart w:id="28" w:name="_Toc240660988"/>
+      <w:bookmarkStart w:id="28" w:name="_Toc240662360"/>
       <w:r>
         <w:rPr>
           <w:rFonts w:cs="Times New Roman"/>
@@ -8375,7 +8388,7 @@
                 <w:noProof/>
               </w:rPr>
               <w:drawing>
-                <wp:inline distT="0" distB="0" distL="0" distR="0" wp14:anchorId="32662C89" wp14:editId="14C74855">
+                <wp:inline distT="0" distB="0" distL="0" distR="0" wp14:anchorId="1BF259D2" wp14:editId="3B6CA04F">
                   <wp:extent cx="3886200" cy="1107831"/>
                   <wp:effectExtent l="0" t="0" r="0" b="0"/>
                   <wp:docPr id="5" name="Picture 5"/>
@@ -8390,7 +8403,7 @@
                           <pic:cNvPicPr/>
                         </pic:nvPicPr>
                         <pic:blipFill>
-                          <a:blip r:embed="rId17"/>
+                          <a:blip r:embed="rId18"/>
                           <a:stretch>
                             <a:fillRect/>
                           </a:stretch>
@@ -8469,7 +8482,7 @@
       <w:pPr>
         <w:pStyle w:val="21"/>
       </w:pPr>
-      <w:bookmarkStart w:id="29" w:name="_Toc240660989"/>
+      <w:bookmarkStart w:id="29" w:name="_Toc240662361"/>
       <w:r>
         <w:rPr>
           <w:rFonts w:cs="Times New Roman"/>
@@ -8542,7 +8555,7 @@
                 <w:noProof/>
               </w:rPr>
               <w:drawing>
-                <wp:inline distT="0" distB="0" distL="0" distR="0" wp14:anchorId="3C2EA013" wp14:editId="63BFBF68">
+                <wp:inline distT="0" distB="0" distL="0" distR="0" wp14:anchorId="514EDA6E" wp14:editId="591E7EBC">
                   <wp:extent cx="4800600" cy="894786"/>
                   <wp:effectExtent l="0" t="0" r="0" b="0"/>
                   <wp:docPr id="6" name="Picture 6"/>
@@ -8557,7 +8570,7 @@
                           <pic:cNvPicPr/>
                         </pic:nvPicPr>
                         <pic:blipFill>
-                          <a:blip r:embed="rId18"/>
+                          <a:blip r:embed="rId19"/>
                           <a:stretch>
                             <a:fillRect/>
                           </a:stretch>
@@ -8732,7 +8745,7 @@
                 <w:noProof/>
               </w:rPr>
               <w:drawing>
-                <wp:inline distT="0" distB="0" distL="0" distR="0" wp14:anchorId="4E1EF610" wp14:editId="14D29244">
+                <wp:inline distT="0" distB="0" distL="0" distR="0" wp14:anchorId="01F0C4CC" wp14:editId="0CBA7910">
                   <wp:extent cx="2331720" cy="571930"/>
                   <wp:effectExtent l="0" t="0" r="0" b="0"/>
                   <wp:docPr id="7" name="Picture 7"/>
@@ -8747,7 +8760,7 @@
                           <pic:cNvPicPr/>
                         </pic:nvPicPr>
                         <pic:blipFill>
-                          <a:blip r:embed="rId19"/>
+                          <a:blip r:embed="rId20"/>
                           <a:stretch>
                             <a:fillRect/>
                           </a:stretch>
@@ -8821,7 +8834,7 @@
       <w:pPr>
         <w:pStyle w:val="21"/>
       </w:pPr>
-      <w:bookmarkStart w:id="30" w:name="_Toc240660990"/>
+      <w:bookmarkStart w:id="30" w:name="_Toc240662362"/>
       <w:r>
         <w:rPr>
           <w:rFonts w:cs="Times New Roman"/>
@@ -8934,7 +8947,7 @@
                 <w:noProof/>
               </w:rPr>
               <w:drawing>
-                <wp:inline distT="0" distB="0" distL="0" distR="0" wp14:anchorId="6D41F4FF" wp14:editId="1660C09E">
+                <wp:inline distT="0" distB="0" distL="0" distR="0" wp14:anchorId="68C32212" wp14:editId="20FEF369">
                   <wp:extent cx="5166360" cy="2898902"/>
                   <wp:effectExtent l="0" t="0" r="0" b="0"/>
                   <wp:docPr id="8" name="Picture 8"/>
@@ -8949,7 +8962,7 @@
                           <pic:cNvPicPr/>
                         </pic:nvPicPr>
                         <pic:blipFill>
-                          <a:blip r:embed="rId20"/>
+                          <a:blip r:embed="rId21"/>
                           <a:stretch>
                             <a:fillRect/>
                           </a:stretch>
@@ -9033,7 +9046,7 @@
       <w:pPr>
         <w:pStyle w:val="21"/>
       </w:pPr>
-      <w:bookmarkStart w:id="31" w:name="_Toc240660991"/>
+      <w:bookmarkStart w:id="31" w:name="_Toc240662363"/>
       <w:r>
         <w:rPr>
           <w:rFonts w:cs="Times New Roman"/>
@@ -9126,7 +9139,7 @@
                 <w:noProof/>
               </w:rPr>
               <w:drawing>
-                <wp:inline distT="0" distB="0" distL="0" distR="0" wp14:anchorId="18CA291E" wp14:editId="1E9834D3">
+                <wp:inline distT="0" distB="0" distL="0" distR="0" wp14:anchorId="6FCCB665" wp14:editId="1B7E23D3">
                   <wp:extent cx="5257800" cy="1399464"/>
                   <wp:effectExtent l="0" t="0" r="0" b="0"/>
                   <wp:docPr id="9" name="Picture 9"/>
@@ -9141,7 +9154,7 @@
                           <pic:cNvPicPr/>
                         </pic:nvPicPr>
                         <pic:blipFill>
-                          <a:blip r:embed="rId21"/>
+                          <a:blip r:embed="rId22"/>
                           <a:stretch>
                             <a:fillRect/>
                           </a:stretch>
@@ -9255,7 +9268,7 @@
       <w:pPr>
         <w:pStyle w:val="21"/>
       </w:pPr>
-      <w:bookmarkStart w:id="32" w:name="_Toc240660992"/>
+      <w:bookmarkStart w:id="32" w:name="_Toc240662364"/>
       <w:r>
         <w:rPr>
           <w:rFonts w:cs="Times New Roman"/>
@@ -9328,7 +9341,7 @@
                 <w:noProof/>
               </w:rPr>
               <w:drawing>
-                <wp:inline distT="0" distB="0" distL="0" distR="0" wp14:anchorId="502F3CB9" wp14:editId="3F395648">
+                <wp:inline distT="0" distB="0" distL="0" distR="0" wp14:anchorId="5131151E" wp14:editId="6303F3F7">
                   <wp:extent cx="4709160" cy="568653"/>
                   <wp:effectExtent l="0" t="0" r="0" b="0"/>
                   <wp:docPr id="10" name="Picture 10"/>
@@ -9343,7 +9356,7 @@
                           <pic:cNvPicPr/>
                         </pic:nvPicPr>
                         <pic:blipFill>
-                          <a:blip r:embed="rId22"/>
+                          <a:blip r:embed="rId23"/>
                           <a:stretch>
                             <a:fillRect/>
                           </a:stretch>
@@ -9398,7 +9411,7 @@
         <w:pStyle w:val="1"/>
         <w:pageBreakBefore/>
       </w:pPr>
-      <w:bookmarkStart w:id="33" w:name="_Toc240660993"/>
+      <w:bookmarkStart w:id="33" w:name="_Toc240662365"/>
       <w:r>
         <w:lastRenderedPageBreak/>
         <w:t>Глава 4. Реализация и численная устойчивость</w:t>
@@ -9409,7 +9422,7 @@
       <w:pPr>
         <w:pStyle w:val="21"/>
       </w:pPr>
-      <w:bookmarkStart w:id="34" w:name="_Toc240660994"/>
+      <w:bookmarkStart w:id="34" w:name="_Toc240662366"/>
       <w:r>
         <w:rPr>
           <w:rFonts w:cs="Times New Roman"/>
@@ -9499,23 +9512,10 @@
       </w:r>
     </w:p>
     <w:p>
-      <w:r>
-        <w:t xml:space="preserve">Полный исходный код и материалы воспроизводимой проверки доступны в репозитории проекта: </w:t>
-      </w:r>
-      <w:hyperlink r:id="rId23">
-        <w:r>
-          <w:t>https://github.com/shumakovaes/ClickHouse/tree/coursework/time-series-extensions/coursework</w:t>
-        </w:r>
-      </w:hyperlink>
-      <w:r>
-        <w:t xml:space="preserve"> (дата обращения: 18.09.2026).</w:t>
-      </w:r>
-    </w:p>
-    <w:p>
       <w:pPr>
         <w:pStyle w:val="21"/>
       </w:pPr>
-      <w:bookmarkStart w:id="35" w:name="_Toc240660995"/>
+      <w:bookmarkStart w:id="35" w:name="_Toc240662367"/>
       <w:r>
         <w:rPr>
           <w:rFonts w:cs="Times New Roman"/>
@@ -9582,6 +9582,8 @@
       </w:r>
       <w:r>
         <w:tab/>
+      </w:r>
+      <w:r>
         <w:t>Перед serialization, merge и finalization vector сортируется и проверяется на строгую уникальность.</w:t>
       </w:r>
     </w:p>
@@ -9658,7 +9660,7 @@
       <w:pPr>
         <w:pStyle w:val="21"/>
       </w:pPr>
-      <w:bookmarkStart w:id="36" w:name="_Toc240660996"/>
+      <w:bookmarkStart w:id="36" w:name="_Toc240662368"/>
       <w:r>
         <w:rPr>
           <w:rFonts w:cs="Times New Roman"/>
@@ -9669,15 +9671,12 @@
     </w:p>
     <w:p>
       <w:r>
-        <w:t xml:space="preserve">Сериализация canonical state обеспечивает одинаковый порядок байтов для одного и того же keyed dataset. В envelope записываются версия формата, function kind, параметры и delegated </w:t>
-      </w:r>
+        <w:t>Сериализация canonical state обеспечивает одинаковый порядок байтов для одного и того же keyed dataset. В envelope записываются версия формата, function kind, параметры и delegated payload. Deserializer проверяет unsupported version/kind, truncation, malformed count, non-increasing keys, non-finite values, несовместимый cap и mismatch параметров.</w:t>
+      </w:r>
+    </w:p>
+    <w:p>
       <w:r>
         <w:lastRenderedPageBreak/>
-        <w:t>payload. Deserializer проверяет unsupported version/kind, truncation, malformed count, non-increasing keys, non-finite values, несовместимый cap и mismatch параметров.</w:t>
-      </w:r>
-    </w:p>
-    <w:p>
-      <w:r>
         <w:t>Низкоуровневый GoogleTest позволяет передавать произвольные повреждённые bytes и проверять, что ошибка возникает безопасно. SQL-тест не может самостоятельно изготовить любой opaque state, поэтому malformed envelope tests остаются ответственностью native harness.</w:t>
       </w:r>
     </w:p>
@@ -9685,7 +9684,7 @@
       <w:pPr>
         <w:pStyle w:val="21"/>
       </w:pPr>
-      <w:bookmarkStart w:id="37" w:name="_Toc240660997"/>
+      <w:bookmarkStart w:id="37" w:name="_Toc240662369"/>
       <w:r>
         <w:rPr>
           <w:rFonts w:cs="Times New Roman"/>
@@ -9728,7 +9727,7 @@
       <w:pPr>
         <w:pStyle w:val="21"/>
       </w:pPr>
-      <w:bookmarkStart w:id="38" w:name="_Toc240660998"/>
+      <w:bookmarkStart w:id="38" w:name="_Toc240662370"/>
       <w:r>
         <w:rPr>
           <w:rFonts w:cs="Times New Roman"/>
@@ -9794,7 +9793,7 @@
         </w:rPr>
         <w:lastRenderedPageBreak/>
         <w:drawing>
-          <wp:inline distT="0" distB="0" distL="0" distR="0" wp14:anchorId="15AFD02A" wp14:editId="14D1A417">
+          <wp:inline distT="0" distB="0" distL="0" distR="0" wp14:anchorId="29B3434B" wp14:editId="5D2951B0">
             <wp:extent cx="5394960" cy="3180187"/>
             <wp:effectExtent l="0" t="0" r="0" b="0"/>
             <wp:docPr id="11" name="Picture 11" descr="Рисунок 2 - Измеренный рост размера сериализованного состояния"/>
@@ -9846,7 +9845,7 @@
         <w:pStyle w:val="1"/>
         <w:pageBreakBefore/>
       </w:pPr>
-      <w:bookmarkStart w:id="39" w:name="_Toc240660999"/>
+      <w:bookmarkStart w:id="39" w:name="_Toc240662371"/>
       <w:r>
         <w:lastRenderedPageBreak/>
         <w:t>Глава 5. Тестирование, эксперименты и оценка производительности</w:t>
@@ -9857,7 +9856,7 @@
       <w:pPr>
         <w:pStyle w:val="21"/>
       </w:pPr>
-      <w:bookmarkStart w:id="40" w:name="_Toc240661000"/>
+      <w:bookmarkStart w:id="40" w:name="_Toc240662372"/>
       <w:r>
         <w:rPr>
           <w:rFonts w:cs="Times New Roman"/>
@@ -9982,7 +9981,7 @@
       <w:pPr>
         <w:pStyle w:val="21"/>
       </w:pPr>
-      <w:bookmarkStart w:id="41" w:name="_Toc240661001"/>
+      <w:bookmarkStart w:id="41" w:name="_Toc240662373"/>
       <w:r>
         <w:rPr>
           <w:rFonts w:cs="Times New Roman"/>
@@ -10959,7 +10958,7 @@
       <w:pPr>
         <w:pStyle w:val="21"/>
       </w:pPr>
-      <w:bookmarkStart w:id="42" w:name="_Toc240661002"/>
+      <w:bookmarkStart w:id="42" w:name="_Toc240662374"/>
       <w:r>
         <w:rPr>
           <w:rFonts w:cs="Times New Roman"/>
@@ -11193,7 +11192,7 @@
       <w:pPr>
         <w:pStyle w:val="21"/>
       </w:pPr>
-      <w:bookmarkStart w:id="43" w:name="_Toc240661003"/>
+      <w:bookmarkStart w:id="43" w:name="_Toc240662375"/>
       <w:r>
         <w:rPr>
           <w:rFonts w:cs="Times New Roman"/>
@@ -11793,7 +11792,7 @@
       <w:pPr>
         <w:pStyle w:val="21"/>
       </w:pPr>
-      <w:bookmarkStart w:id="44" w:name="_Toc240661004"/>
+      <w:bookmarkStart w:id="44" w:name="_Toc240662376"/>
       <w:r>
         <w:rPr>
           <w:rFonts w:cs="Times New Roman"/>
@@ -11941,7 +11940,7 @@
       <w:pPr>
         <w:pStyle w:val="21"/>
       </w:pPr>
-      <w:bookmarkStart w:id="45" w:name="_Toc240661005"/>
+      <w:bookmarkStart w:id="45" w:name="_Toc240662377"/>
       <w:r>
         <w:rPr>
           <w:rFonts w:cs="Times New Roman"/>
@@ -12043,7 +12042,7 @@
       <w:pPr>
         <w:pStyle w:val="21"/>
       </w:pPr>
-      <w:bookmarkStart w:id="46" w:name="_Toc240661006"/>
+      <w:bookmarkStart w:id="46" w:name="_Toc240662378"/>
       <w:r>
         <w:rPr>
           <w:rFonts w:cs="Times New Roman"/>
@@ -12964,7 +12963,7 @@
       <w:pPr>
         <w:pStyle w:val="21"/>
       </w:pPr>
-      <w:bookmarkStart w:id="47" w:name="_Toc240661007"/>
+      <w:bookmarkStart w:id="47" w:name="_Toc240662379"/>
       <w:r>
         <w:rPr>
           <w:rFonts w:cs="Times New Roman"/>
@@ -13121,7 +13120,7 @@
       <w:pPr>
         <w:pStyle w:val="21"/>
       </w:pPr>
-      <w:bookmarkStart w:id="48" w:name="_Toc240661008"/>
+      <w:bookmarkStart w:id="48" w:name="_Toc240662380"/>
       <w:r>
         <w:rPr>
           <w:rFonts w:cs="Times New Roman"/>
@@ -13213,7 +13212,7 @@
         <w:pStyle w:val="1"/>
         <w:pageBreakBefore/>
       </w:pPr>
-      <w:bookmarkStart w:id="49" w:name="_Toc240661009"/>
+      <w:bookmarkStart w:id="49" w:name="_Toc240662381"/>
       <w:r>
         <w:lastRenderedPageBreak/>
         <w:t>Заключение</w:t>
@@ -13446,7 +13445,7 @@
         <w:pStyle w:val="1"/>
         <w:pageBreakBefore/>
       </w:pPr>
-      <w:bookmarkStart w:id="50" w:name="_Toc240661010"/>
+      <w:bookmarkStart w:id="50" w:name="_Toc240662382"/>
       <w:r>
         <w:lastRenderedPageBreak/>
         <w:t>Список использованных источников</w:t>
@@ -13858,7 +13857,7 @@
         <w:pStyle w:val="1"/>
         <w:pageBreakBefore/>
       </w:pPr>
-      <w:bookmarkStart w:id="51" w:name="_Toc240661011"/>
+      <w:bookmarkStart w:id="51" w:name="_Toc240662383"/>
       <w:r>
         <w:lastRenderedPageBreak/>
         <w:t>Приложение А. Карта файлов проекта и материалов проверки</w:t>
@@ -15083,7 +15082,7 @@
         <w:pStyle w:val="1"/>
         <w:pageBreakBefore/>
       </w:pPr>
-      <w:bookmarkStart w:id="52" w:name="_Toc240661012"/>
+      <w:bookmarkStart w:id="52" w:name="_Toc240662384"/>
       <w:r>
         <w:lastRenderedPageBreak/>
         <w:t>Приложение Б. Понятный порядок самостоятельной проверки</w:t>
@@ -15564,7 +15563,7 @@
         <w:pStyle w:val="1"/>
         <w:pageBreakBefore/>
       </w:pPr>
-      <w:bookmarkStart w:id="53" w:name="_Toc240661013"/>
+      <w:bookmarkStart w:id="53" w:name="_Toc240662385"/>
       <w:r>
         <w:lastRenderedPageBreak/>
         <w:t>Приложение В. Краткий словарь терминов</w:t>
@@ -16399,7 +16398,7 @@
     <w:autoRedefine/>
     <w:uiPriority w:val="39"/>
     <w:unhideWhenUsed/>
-    <w:rsid w:val="00F40328"/>
+    <w:rsid w:val="00A2255B"/>
     <w:pPr>
       <w:spacing w:after="100"/>
     </w:pPr>
@@ -16411,7 +16410,7 @@
     <w:autoRedefine/>
     <w:uiPriority w:val="39"/>
     <w:unhideWhenUsed/>
-    <w:rsid w:val="00F40328"/>
+    <w:rsid w:val="00A2255B"/>
     <w:pPr>
       <w:spacing w:after="100"/>
       <w:ind w:left="240"/>
@@ -16422,7 +16421,7 @@
     <w:basedOn w:val="a0"/>
     <w:uiPriority w:val="99"/>
     <w:unhideWhenUsed/>
-    <w:rsid w:val="00F40328"/>
+    <w:rsid w:val="00A2255B"/>
     <w:rPr>
       <w:color w:val="0000FF" w:themeColor="hyperlink"/>
       <w:u w:val="single"/>
@@ -16434,7 +16433,7 @@
     <w:link w:val="a8"/>
     <w:uiPriority w:val="99"/>
     <w:unhideWhenUsed/>
-    <w:rsid w:val="00F40328"/>
+    <w:rsid w:val="00A2255B"/>
     <w:pPr>
       <w:tabs>
         <w:tab w:val="center" w:pos="4677"/>
@@ -16448,7 +16447,7 @@
     <w:basedOn w:val="a0"/>
     <w:link w:val="a7"/>
     <w:uiPriority w:val="99"/>
-    <w:rsid w:val="00F40328"/>
+    <w:rsid w:val="00A2255B"/>
     <w:rPr>
       <w:rFonts w:ascii="Times New Roman" w:eastAsia="Times New Roman" w:hAnsi="Times New Roman" w:cs="Times New Roman"/>
       <w:color w:val="000000"/>
@@ -16462,7 +16461,7 @@
     <w:link w:val="aa"/>
     <w:uiPriority w:val="99"/>
     <w:unhideWhenUsed/>
-    <w:rsid w:val="00F40328"/>
+    <w:rsid w:val="00A2255B"/>
     <w:pPr>
       <w:tabs>
         <w:tab w:val="center" w:pos="4677"/>
@@ -16476,7 +16475,7 @@
     <w:basedOn w:val="a0"/>
     <w:link w:val="a9"/>
     <w:uiPriority w:val="99"/>
-    <w:rsid w:val="00F40328"/>
+    <w:rsid w:val="00A2255B"/>
     <w:rPr>
       <w:rFonts w:ascii="Times New Roman" w:eastAsia="Times New Roman" w:hAnsi="Times New Roman" w:cs="Times New Roman"/>
       <w:color w:val="000000"/>

</xml_diff>